<commit_message>
code: se agrego la funcionalidad de discucion entre clientes y lideres, se agrego dashboard de cliente y se modularizo el codigo del sistema
</commit_message>
<xml_diff>
--- a/3-CONSTRUCCION/ITERACIÓN 2/35. Casos de Pruebas/Errores encontrados CU-06_registrar requerimientos.docx
+++ b/3-CONSTRUCCION/ITERACIÓN 2/35. Casos de Pruebas/Errores encontrados CU-06_registrar requerimientos.docx
@@ -50,6 +50,7 @@
             <w:pPr>
               <w:pStyle w:val="Normal"/>
               <w:widowControl/>
+              <w:suppressAutoHyphens w:val="true"/>
               <w:spacing w:lineRule="auto" w:line="360" w:before="0" w:after="120"/>
               <w:jc w:val="start"/>
               <w:rPr>
@@ -80,6 +81,7 @@
             <w:pPr>
               <w:pStyle w:val="Normal"/>
               <w:widowControl/>
+              <w:suppressAutoHyphens w:val="true"/>
               <w:spacing w:lineRule="auto" w:line="360" w:before="0" w:after="120"/>
               <w:jc w:val="start"/>
               <w:rPr>
@@ -110,6 +112,7 @@
             <w:pPr>
               <w:pStyle w:val="Normal"/>
               <w:widowControl/>
+              <w:suppressAutoHyphens w:val="true"/>
               <w:spacing w:lineRule="auto" w:line="360" w:before="0" w:after="120"/>
               <w:jc w:val="start"/>
               <w:rPr>
@@ -140,6 +143,7 @@
             <w:pPr>
               <w:pStyle w:val="Normal"/>
               <w:widowControl/>
+              <w:suppressAutoHyphens w:val="true"/>
               <w:spacing w:lineRule="auto" w:line="360" w:before="0" w:after="120"/>
               <w:jc w:val="start"/>
               <w:rPr>
@@ -173,6 +177,7 @@
             <w:pPr>
               <w:pStyle w:val="Normal"/>
               <w:widowControl/>
+              <w:suppressAutoHyphens w:val="true"/>
               <w:spacing w:lineRule="auto" w:line="360" w:before="0" w:after="120"/>
               <w:jc w:val="start"/>
               <w:rPr>
@@ -270,6 +275,7 @@
             <w:pPr>
               <w:pStyle w:val="Normal"/>
               <w:widowControl/>
+              <w:suppressAutoHyphens w:val="true"/>
               <w:spacing w:lineRule="auto" w:line="360" w:before="0" w:after="120"/>
               <w:jc w:val="start"/>
               <w:rPr>
@@ -323,6 +329,7 @@
             <w:pPr>
               <w:pStyle w:val="Normal"/>
               <w:widowControl/>
+              <w:suppressAutoHyphens w:val="true"/>
               <w:spacing w:lineRule="auto" w:line="360" w:before="0" w:after="120"/>
               <w:jc w:val="start"/>
               <w:rPr>
@@ -356,6 +363,7 @@
             <w:pPr>
               <w:pStyle w:val="Normal"/>
               <w:widowControl/>
+              <w:suppressAutoHyphens w:val="true"/>
               <w:spacing w:lineRule="auto" w:line="360" w:before="0" w:after="120"/>
               <w:jc w:val="start"/>
               <w:rPr>
@@ -392,6 +400,7 @@
             <w:pPr>
               <w:pStyle w:val="Normal"/>
               <w:widowControl/>
+              <w:suppressAutoHyphens w:val="true"/>
               <w:spacing w:lineRule="auto" w:line="240" w:before="0" w:after="0"/>
               <w:jc w:val="start"/>
               <w:rPr>
@@ -417,6 +426,7 @@
             <w:pPr>
               <w:pStyle w:val="Normal"/>
               <w:widowControl/>
+              <w:suppressAutoHyphens w:val="true"/>
               <w:spacing w:lineRule="auto" w:line="240" w:before="0" w:after="0"/>
               <w:jc w:val="start"/>
               <w:rPr>
@@ -448,6 +458,7 @@
             <w:pPr>
               <w:pStyle w:val="Normal"/>
               <w:widowControl/>
+              <w:suppressAutoHyphens w:val="true"/>
               <w:spacing w:lineRule="auto" w:line="240" w:before="0" w:after="0"/>
               <w:jc w:val="start"/>
               <w:rPr>
@@ -479,6 +490,7 @@
             <w:pPr>
               <w:pStyle w:val="Normal"/>
               <w:widowControl/>
+              <w:suppressAutoHyphens w:val="true"/>
               <w:spacing w:lineRule="auto" w:line="240" w:before="0" w:after="0"/>
               <w:jc w:val="start"/>
               <w:rPr>
@@ -509,6 +521,7 @@
             <w:pPr>
               <w:pStyle w:val="Normal"/>
               <w:widowControl/>
+              <w:suppressAutoHyphens w:val="true"/>
               <w:spacing w:lineRule="auto" w:line="240" w:before="0" w:after="0"/>
               <w:jc w:val="start"/>
               <w:rPr>
@@ -542,6 +555,7 @@
             <w:pPr>
               <w:pStyle w:val="Normal"/>
               <w:widowControl/>
+              <w:suppressAutoHyphens w:val="true"/>
               <w:spacing w:lineRule="auto" w:line="240" w:before="0" w:after="0"/>
               <w:jc w:val="start"/>
               <w:rPr>
@@ -567,6 +581,7 @@
             <w:pPr>
               <w:pStyle w:val="Normal"/>
               <w:widowControl/>
+              <w:suppressAutoHyphens w:val="true"/>
               <w:spacing w:lineRule="auto" w:line="240" w:before="0" w:after="0"/>
               <w:jc w:val="start"/>
               <w:rPr>
@@ -591,6 +606,7 @@
             <w:pPr>
               <w:pStyle w:val="Normal"/>
               <w:widowControl/>
+              <w:suppressAutoHyphens w:val="true"/>
               <w:spacing w:lineRule="auto" w:line="240" w:before="0" w:after="0"/>
               <w:jc w:val="start"/>
               <w:rPr>
@@ -642,6 +658,7 @@
                 <w:ilvl w:val="0"/>
                 <w:numId w:val="1"/>
               </w:numPr>
+              <w:suppressAutoHyphens w:val="true"/>
               <w:spacing w:lineRule="auto" w:line="240" w:before="0" w:after="0"/>
               <w:jc w:val="start"/>
               <w:rPr>
@@ -683,6 +700,7 @@
                 <w:ilvl w:val="0"/>
                 <w:numId w:val="1"/>
               </w:numPr>
+              <w:suppressAutoHyphens w:val="true"/>
               <w:spacing w:lineRule="auto" w:line="240" w:before="0" w:after="0"/>
               <w:jc w:val="start"/>
               <w:rPr>
@@ -724,6 +742,7 @@
                 <w:ilvl w:val="0"/>
                 <w:numId w:val="1"/>
               </w:numPr>
+              <w:suppressAutoHyphens w:val="true"/>
               <w:spacing w:lineRule="auto" w:line="240" w:before="0" w:after="0"/>
               <w:jc w:val="start"/>
               <w:rPr>
@@ -761,6 +780,7 @@
             <w:pPr>
               <w:pStyle w:val="Normal"/>
               <w:widowControl/>
+              <w:suppressAutoHyphens w:val="true"/>
               <w:spacing w:lineRule="auto" w:line="240" w:before="0" w:after="0"/>
               <w:jc w:val="start"/>
               <w:rPr>
@@ -792,6 +812,7 @@
             <w:pPr>
               <w:pStyle w:val="Normal"/>
               <w:widowControl/>
+              <w:suppressAutoHyphens w:val="true"/>
               <w:spacing w:lineRule="auto" w:line="240" w:before="0" w:after="0"/>
               <w:jc w:val="start"/>
               <w:rPr>
@@ -817,6 +838,7 @@
             <w:pPr>
               <w:pStyle w:val="Normal"/>
               <w:widowControl/>
+              <w:suppressAutoHyphens w:val="true"/>
               <w:spacing w:lineRule="auto" w:line="240" w:before="0" w:after="0"/>
               <w:jc w:val="start"/>
               <w:rPr>
@@ -864,6 +886,7 @@
             <w:pPr>
               <w:pStyle w:val="Normal"/>
               <w:widowControl/>
+              <w:suppressAutoHyphens w:val="true"/>
               <w:spacing w:lineRule="auto" w:line="240" w:before="0" w:after="0"/>
               <w:jc w:val="start"/>
               <w:rPr>
@@ -895,6 +918,7 @@
             <w:pPr>
               <w:pStyle w:val="Normal"/>
               <w:widowControl/>
+              <w:suppressAutoHyphens w:val="true"/>
               <w:spacing w:lineRule="auto" w:line="240" w:before="0" w:after="0"/>
               <w:jc w:val="start"/>
               <w:rPr>
@@ -925,6 +949,7 @@
             <w:pPr>
               <w:pStyle w:val="Normal"/>
               <w:widowControl/>
+              <w:suppressAutoHyphens w:val="true"/>
               <w:spacing w:lineRule="auto" w:line="240" w:before="0" w:after="0"/>
               <w:jc w:val="start"/>
               <w:rPr>
@@ -958,6 +983,7 @@
             <w:pPr>
               <w:pStyle w:val="Normal"/>
               <w:widowControl/>
+              <w:suppressAutoHyphens w:val="true"/>
               <w:spacing w:lineRule="auto" w:line="240" w:before="0" w:after="0"/>
               <w:jc w:val="start"/>
               <w:rPr>
@@ -989,6 +1015,7 @@
             <w:pPr>
               <w:pStyle w:val="Normal"/>
               <w:widowControl/>
+              <w:suppressAutoHyphens w:val="true"/>
               <w:spacing w:lineRule="auto" w:line="240" w:before="0" w:after="0"/>
               <w:jc w:val="start"/>
               <w:rPr>
@@ -1020,6 +1047,7 @@
             <w:pPr>
               <w:pStyle w:val="Normal"/>
               <w:widowControl/>
+              <w:suppressAutoHyphens w:val="true"/>
               <w:spacing w:lineRule="auto" w:line="240" w:before="0" w:after="0"/>
               <w:jc w:val="start"/>
               <w:rPr>
@@ -1050,6 +1078,7 @@
             <w:pPr>
               <w:pStyle w:val="Normal"/>
               <w:widowControl/>
+              <w:suppressAutoHyphens w:val="true"/>
               <w:spacing w:lineRule="auto" w:line="240" w:before="0" w:after="0"/>
               <w:jc w:val="start"/>
               <w:rPr>
@@ -1083,6 +1112,7 @@
             <w:pPr>
               <w:pStyle w:val="Normal"/>
               <w:widowControl/>
+              <w:suppressAutoHyphens w:val="true"/>
               <w:spacing w:lineRule="auto" w:line="240" w:before="0" w:after="0"/>
               <w:jc w:val="start"/>
               <w:rPr>
@@ -1108,6 +1138,7 @@
             <w:pPr>
               <w:pStyle w:val="Normal"/>
               <w:widowControl/>
+              <w:suppressAutoHyphens w:val="true"/>
               <w:spacing w:lineRule="auto" w:line="240" w:before="0" w:after="0"/>
               <w:jc w:val="start"/>
               <w:rPr>
@@ -1132,6 +1163,7 @@
             <w:pPr>
               <w:pStyle w:val="Normal"/>
               <w:widowControl/>
+              <w:suppressAutoHyphens w:val="true"/>
               <w:spacing w:lineRule="auto" w:line="240" w:before="0" w:after="0"/>
               <w:jc w:val="start"/>
               <w:rPr>
@@ -1163,6 +1195,7 @@
             <w:pPr>
               <w:pStyle w:val="Normal"/>
               <w:widowControl/>
+              <w:suppressAutoHyphens w:val="true"/>
               <w:spacing w:lineRule="auto" w:line="240" w:before="0" w:after="0"/>
               <w:jc w:val="start"/>
               <w:rPr>
@@ -1188,6 +1221,7 @@
             <w:pPr>
               <w:pStyle w:val="Normal"/>
               <w:widowControl/>
+              <w:suppressAutoHyphens w:val="true"/>
               <w:spacing w:lineRule="auto" w:line="240" w:before="0" w:after="0"/>
               <w:jc w:val="start"/>
               <w:rPr>
@@ -1212,6 +1246,7 @@
             <w:pPr>
               <w:pStyle w:val="Normal"/>
               <w:widowControl/>
+              <w:suppressAutoHyphens w:val="true"/>
               <w:spacing w:lineRule="auto" w:line="240" w:before="0" w:after="0"/>
               <w:jc w:val="start"/>
               <w:rPr>
@@ -1243,24 +1278,25 @@
             <w:pPr>
               <w:pStyle w:val="Normal"/>
               <w:widowControl/>
-              <w:spacing w:lineRule="auto" w:line="240" w:before="0" w:after="0"/>
-              <w:jc w:val="start"/>
-              <w:rPr>
-                <w:b/>
-                <w:bCs/>
-              </w:rPr>
-            </w:pPr>
-            <w:r>
-              <w:rPr>
-                <w:rFonts w:eastAsia="Aptos" w:cs=""/>
-                <w:b/>
-                <w:bCs/>
-                <w:kern w:val="2"/>
-                <w:sz w:val="24"/>
-                <w:szCs w:val="22"/>
-                <w:lang w:val="es-AR" w:eastAsia="en-US" w:bidi="ar-SA"/>
-              </w:rPr>
-              <w:t>PENDIENTE</w:t>
+              <w:suppressAutoHyphens w:val="true"/>
+              <w:spacing w:lineRule="auto" w:line="240" w:before="0" w:after="0"/>
+              <w:jc w:val="start"/>
+              <w:rPr>
+                <w:b/>
+                <w:bCs/>
+              </w:rPr>
+            </w:pPr>
+            <w:r>
+              <w:rPr>
+                <w:rFonts w:eastAsia="Aptos" w:cs=""/>
+                <w:b/>
+                <w:bCs/>
+                <w:kern w:val="2"/>
+                <w:sz w:val="24"/>
+                <w:szCs w:val="22"/>
+                <w:lang w:val="es-AR" w:eastAsia="en-US" w:bidi="ar-SA"/>
+              </w:rPr>
+              <w:t>COMPLETADO</w:t>
             </w:r>
           </w:p>
         </w:tc>
@@ -1273,6 +1309,7 @@
             <w:pPr>
               <w:pStyle w:val="Normal"/>
               <w:widowControl/>
+              <w:suppressAutoHyphens w:val="true"/>
               <w:spacing w:lineRule="auto" w:line="240" w:before="0" w:after="0"/>
               <w:jc w:val="start"/>
               <w:rPr>
@@ -1306,6 +1343,7 @@
             <w:pPr>
               <w:pStyle w:val="Normal"/>
               <w:widowControl/>
+              <w:suppressAutoHyphens w:val="true"/>
               <w:spacing w:lineRule="auto" w:line="240" w:before="0" w:after="0"/>
               <w:jc w:val="start"/>
               <w:rPr>
@@ -1337,6 +1375,7 @@
             <w:pPr>
               <w:pStyle w:val="Normal"/>
               <w:widowControl/>
+              <w:suppressAutoHyphens w:val="true"/>
               <w:spacing w:lineRule="auto" w:line="240" w:before="0" w:after="0"/>
               <w:jc w:val="start"/>
               <w:rPr>
@@ -1368,22 +1407,18 @@
             <w:pPr>
               <w:pStyle w:val="Normal"/>
               <w:widowControl/>
-              <w:spacing w:lineRule="auto" w:line="240" w:before="0" w:after="0"/>
-              <w:jc w:val="start"/>
-              <w:rPr>
-                <w:b/>
-                <w:bCs/>
-              </w:rPr>
-            </w:pPr>
-            <w:r>
-              <w:rPr>
-                <w:rFonts w:eastAsia="Aptos" w:cs=""/>
-                <w:b/>
-                <w:bCs/>
-                <w:kern w:val="2"/>
-                <w:sz w:val="24"/>
-                <w:szCs w:val="22"/>
-                <w:lang w:val="es-AR" w:eastAsia="en-US" w:bidi="ar-SA"/>
+              <w:suppressAutoHyphens w:val="true"/>
+              <w:spacing w:lineRule="auto" w:line="240" w:before="0" w:after="0"/>
+              <w:jc w:val="start"/>
+              <w:rPr>
+                <w:b/>
+                <w:bCs/>
+              </w:rPr>
+            </w:pPr>
+            <w:r>
+              <w:rPr>
+                <w:b/>
+                <w:bCs/>
               </w:rPr>
             </w:r>
           </w:p>
@@ -1397,6 +1432,7 @@
             <w:pPr>
               <w:pStyle w:val="Normal"/>
               <w:widowControl/>
+              <w:suppressAutoHyphens w:val="true"/>
               <w:spacing w:lineRule="auto" w:line="240" w:before="0" w:after="0"/>
               <w:jc w:val="start"/>
               <w:rPr>
@@ -1430,6 +1466,7 @@
             <w:pPr>
               <w:pStyle w:val="Normal"/>
               <w:widowControl/>
+              <w:suppressAutoHyphens w:val="true"/>
               <w:spacing w:lineRule="auto" w:line="240" w:before="0" w:after="0"/>
               <w:jc w:val="start"/>
               <w:rPr>
@@ -1461,6 +1498,7 @@
             <w:pPr>
               <w:pStyle w:val="Normal"/>
               <w:widowControl/>
+              <w:suppressAutoHyphens w:val="true"/>
               <w:spacing w:lineRule="auto" w:line="240" w:before="0" w:after="0"/>
               <w:jc w:val="start"/>
               <w:rPr>
@@ -1486,6 +1524,7 @@
             <w:pPr>
               <w:pStyle w:val="Normal"/>
               <w:widowControl/>
+              <w:suppressAutoHyphens w:val="true"/>
               <w:spacing w:lineRule="auto" w:line="240" w:before="0" w:after="0"/>
               <w:jc w:val="start"/>
               <w:rPr>
@@ -1517,6 +1556,7 @@
             <w:pPr>
               <w:pStyle w:val="Normal"/>
               <w:widowControl/>
+              <w:suppressAutoHyphens w:val="true"/>
               <w:spacing w:lineRule="auto" w:line="240" w:before="0" w:after="0"/>
               <w:jc w:val="start"/>
               <w:rPr>
@@ -1547,6 +1587,7 @@
             <w:pPr>
               <w:pStyle w:val="Normal"/>
               <w:widowControl/>
+              <w:suppressAutoHyphens w:val="true"/>
               <w:spacing w:lineRule="auto" w:line="240" w:before="0" w:after="0"/>
               <w:jc w:val="start"/>
               <w:rPr>
@@ -1580,6 +1621,7 @@
             <w:pPr>
               <w:pStyle w:val="Normal"/>
               <w:widowControl/>
+              <w:suppressAutoHyphens w:val="true"/>
               <w:spacing w:lineRule="auto" w:line="240" w:before="0" w:after="0"/>
               <w:jc w:val="start"/>
               <w:rPr>
@@ -1611,6 +1653,7 @@
             <w:pPr>
               <w:pStyle w:val="Normal"/>
               <w:widowControl/>
+              <w:suppressAutoHyphens w:val="true"/>
               <w:spacing w:lineRule="auto" w:line="240" w:before="0" w:after="0"/>
               <w:jc w:val="start"/>
               <w:rPr>
@@ -1642,6 +1685,7 @@
             <w:pPr>
               <w:pStyle w:val="Normal"/>
               <w:widowControl/>
+              <w:suppressAutoHyphens w:val="true"/>
               <w:spacing w:lineRule="auto" w:line="240" w:before="0" w:after="0"/>
               <w:jc w:val="start"/>
               <w:rPr>
@@ -1672,6 +1716,7 @@
             <w:pPr>
               <w:pStyle w:val="Normal"/>
               <w:widowControl/>
+              <w:suppressAutoHyphens w:val="true"/>
               <w:spacing w:lineRule="auto" w:line="240" w:before="0" w:after="0"/>
               <w:jc w:val="start"/>
               <w:rPr>
@@ -1705,6 +1750,7 @@
             <w:pPr>
               <w:pStyle w:val="Normal"/>
               <w:widowControl/>
+              <w:suppressAutoHyphens w:val="true"/>
               <w:spacing w:lineRule="auto" w:line="240" w:before="0" w:after="0"/>
               <w:jc w:val="start"/>
               <w:rPr>
@@ -1736,6 +1782,7 @@
             <w:pPr>
               <w:pStyle w:val="Normal"/>
               <w:widowControl/>
+              <w:suppressAutoHyphens w:val="true"/>
               <w:spacing w:lineRule="auto" w:line="240" w:before="0" w:after="0"/>
               <w:jc w:val="start"/>
               <w:rPr>
@@ -1761,6 +1808,7 @@
             <w:pPr>
               <w:pStyle w:val="Normal"/>
               <w:widowControl/>
+              <w:suppressAutoHyphens w:val="true"/>
               <w:spacing w:lineRule="auto" w:line="240" w:before="0" w:after="0"/>
               <w:jc w:val="start"/>
               <w:rPr>
@@ -1786,6 +1834,7 @@
             <w:pPr>
               <w:pStyle w:val="Normal"/>
               <w:widowControl/>
+              <w:suppressAutoHyphens w:val="true"/>
               <w:spacing w:lineRule="auto" w:line="240" w:before="0" w:after="0"/>
               <w:jc w:val="start"/>
               <w:rPr>
@@ -1811,6 +1860,7 @@
             <w:pPr>
               <w:pStyle w:val="Normal"/>
               <w:widowControl/>
+              <w:suppressAutoHyphens w:val="true"/>
               <w:spacing w:lineRule="auto" w:line="240" w:before="0" w:after="0"/>
               <w:jc w:val="start"/>
               <w:rPr>
@@ -1836,6 +1886,7 @@
                 <w:ilvl w:val="0"/>
                 <w:numId w:val="2"/>
               </w:numPr>
+              <w:suppressAutoHyphens w:val="true"/>
               <w:spacing w:lineRule="auto" w:line="240" w:before="0" w:after="0"/>
               <w:contextualSpacing/>
               <w:jc w:val="start"/>
@@ -1862,6 +1913,7 @@
                 <w:ilvl w:val="0"/>
                 <w:numId w:val="2"/>
               </w:numPr>
+              <w:suppressAutoHyphens w:val="true"/>
               <w:spacing w:lineRule="auto" w:line="240" w:before="0" w:after="0"/>
               <w:contextualSpacing/>
               <w:jc w:val="start"/>
@@ -1888,6 +1940,7 @@
                 <w:ilvl w:val="0"/>
                 <w:numId w:val="2"/>
               </w:numPr>
+              <w:suppressAutoHyphens w:val="true"/>
               <w:spacing w:lineRule="auto" w:line="240" w:before="0" w:after="0"/>
               <w:contextualSpacing/>
               <w:jc w:val="start"/>
@@ -1914,6 +1967,7 @@
                 <w:ilvl w:val="0"/>
                 <w:numId w:val="2"/>
               </w:numPr>
+              <w:suppressAutoHyphens w:val="true"/>
               <w:spacing w:lineRule="auto" w:line="240" w:before="0" w:after="0"/>
               <w:contextualSpacing/>
               <w:jc w:val="start"/>
@@ -1940,6 +1994,7 @@
                 <w:ilvl w:val="0"/>
                 <w:numId w:val="2"/>
               </w:numPr>
+              <w:suppressAutoHyphens w:val="true"/>
               <w:spacing w:lineRule="auto" w:line="240" w:before="0" w:after="0"/>
               <w:contextualSpacing/>
               <w:jc w:val="start"/>
@@ -1966,6 +2021,7 @@
                 <w:ilvl w:val="0"/>
                 <w:numId w:val="2"/>
               </w:numPr>
+              <w:suppressAutoHyphens w:val="true"/>
               <w:spacing w:lineRule="auto" w:line="240" w:before="0" w:after="0"/>
               <w:contextualSpacing/>
               <w:jc w:val="start"/>
@@ -1992,6 +2048,7 @@
                 <w:ilvl w:val="0"/>
                 <w:numId w:val="2"/>
               </w:numPr>
+              <w:suppressAutoHyphens w:val="true"/>
               <w:spacing w:lineRule="auto" w:line="240" w:before="0" w:after="0"/>
               <w:contextualSpacing/>
               <w:jc w:val="start"/>
@@ -2014,6 +2071,7 @@
             <w:pPr>
               <w:pStyle w:val="Normal"/>
               <w:widowControl/>
+              <w:suppressAutoHyphens w:val="true"/>
               <w:spacing w:lineRule="auto" w:line="240" w:before="0" w:after="0"/>
               <w:jc w:val="start"/>
               <w:rPr>
@@ -2044,6 +2102,7 @@
             <w:pPr>
               <w:pStyle w:val="Normal"/>
               <w:widowControl/>
+              <w:suppressAutoHyphens w:val="true"/>
               <w:spacing w:lineRule="auto" w:line="240" w:before="0" w:after="0"/>
               <w:jc w:val="start"/>
               <w:rPr>
@@ -2074,6 +2133,7 @@
             <w:pPr>
               <w:pStyle w:val="Normal"/>
               <w:widowControl/>
+              <w:suppressAutoHyphens w:val="true"/>
               <w:spacing w:lineRule="auto" w:line="240" w:before="0" w:after="0"/>
               <w:jc w:val="start"/>
               <w:rPr>
@@ -2107,6 +2167,7 @@
             <w:pPr>
               <w:pStyle w:val="Normal"/>
               <w:widowControl/>
+              <w:suppressAutoHyphens w:val="true"/>
               <w:spacing w:lineRule="auto" w:line="240" w:before="0" w:after="0"/>
               <w:jc w:val="start"/>
               <w:rPr>
@@ -2138,6 +2199,7 @@
             <w:pPr>
               <w:pStyle w:val="Normal"/>
               <w:widowControl/>
+              <w:suppressAutoHyphens w:val="true"/>
               <w:spacing w:lineRule="auto" w:line="240" w:before="0" w:after="0"/>
               <w:jc w:val="start"/>
               <w:rPr>
@@ -2163,6 +2225,7 @@
             <w:pPr>
               <w:pStyle w:val="Normal"/>
               <w:widowControl/>
+              <w:suppressAutoHyphens w:val="true"/>
               <w:spacing w:lineRule="auto" w:line="240" w:before="0" w:after="0"/>
               <w:jc w:val="start"/>
               <w:rPr>
@@ -2188,6 +2251,7 @@
             <w:pPr>
               <w:pStyle w:val="Normal"/>
               <w:widowControl/>
+              <w:suppressAutoHyphens w:val="true"/>
               <w:spacing w:lineRule="auto" w:line="240" w:before="0" w:after="0"/>
               <w:jc w:val="start"/>
               <w:rPr>
@@ -2213,6 +2277,7 @@
                 <w:ilvl w:val="0"/>
                 <w:numId w:val="2"/>
               </w:numPr>
+              <w:suppressAutoHyphens w:val="true"/>
               <w:spacing w:lineRule="auto" w:line="240" w:before="0" w:after="0"/>
               <w:contextualSpacing/>
               <w:jc w:val="start"/>
@@ -2239,6 +2304,7 @@
                 <w:ilvl w:val="0"/>
                 <w:numId w:val="2"/>
               </w:numPr>
+              <w:suppressAutoHyphens w:val="true"/>
               <w:spacing w:lineRule="auto" w:line="240" w:before="0" w:after="0"/>
               <w:contextualSpacing/>
               <w:jc w:val="start"/>
@@ -2265,6 +2331,7 @@
                 <w:ilvl w:val="0"/>
                 <w:numId w:val="2"/>
               </w:numPr>
+              <w:suppressAutoHyphens w:val="true"/>
               <w:spacing w:lineRule="auto" w:line="240" w:before="0" w:after="0"/>
               <w:contextualSpacing/>
               <w:jc w:val="start"/>
@@ -2291,6 +2358,7 @@
                 <w:ilvl w:val="0"/>
                 <w:numId w:val="2"/>
               </w:numPr>
+              <w:suppressAutoHyphens w:val="true"/>
               <w:spacing w:lineRule="auto" w:line="240" w:before="0" w:after="0"/>
               <w:contextualSpacing/>
               <w:jc w:val="start"/>
@@ -2317,6 +2385,7 @@
                 <w:ilvl w:val="0"/>
                 <w:numId w:val="2"/>
               </w:numPr>
+              <w:suppressAutoHyphens w:val="true"/>
               <w:spacing w:lineRule="auto" w:line="240" w:before="0" w:after="0"/>
               <w:contextualSpacing/>
               <w:jc w:val="start"/>
@@ -2343,6 +2412,7 @@
                 <w:ilvl w:val="0"/>
                 <w:numId w:val="2"/>
               </w:numPr>
+              <w:suppressAutoHyphens w:val="true"/>
               <w:spacing w:lineRule="auto" w:line="240" w:before="0" w:after="0"/>
               <w:contextualSpacing/>
               <w:jc w:val="start"/>
@@ -2369,6 +2439,7 @@
                 <w:ilvl w:val="0"/>
                 <w:numId w:val="2"/>
               </w:numPr>
+              <w:suppressAutoHyphens w:val="true"/>
               <w:spacing w:lineRule="auto" w:line="240" w:before="0" w:after="0"/>
               <w:contextualSpacing/>
               <w:jc w:val="start"/>
@@ -2395,6 +2466,7 @@
                 <w:ilvl w:val="0"/>
                 <w:numId w:val="2"/>
               </w:numPr>
+              <w:suppressAutoHyphens w:val="true"/>
               <w:spacing w:lineRule="auto" w:line="240" w:before="0" w:after="0"/>
               <w:contextualSpacing/>
               <w:jc w:val="start"/>
@@ -2421,6 +2493,7 @@
                 <w:ilvl w:val="0"/>
                 <w:numId w:val="2"/>
               </w:numPr>
+              <w:suppressAutoHyphens w:val="true"/>
               <w:spacing w:lineRule="auto" w:line="240" w:before="0" w:after="0"/>
               <w:contextualSpacing/>
               <w:jc w:val="start"/>
@@ -2443,6 +2516,7 @@
             <w:pPr>
               <w:pStyle w:val="Normal"/>
               <w:widowControl/>
+              <w:suppressAutoHyphens w:val="true"/>
               <w:spacing w:lineRule="auto" w:line="240" w:before="0" w:after="0"/>
               <w:jc w:val="start"/>
               <w:rPr>
@@ -2473,6 +2547,7 @@
             <w:pPr>
               <w:pStyle w:val="Normal"/>
               <w:widowControl/>
+              <w:suppressAutoHyphens w:val="true"/>
               <w:spacing w:lineRule="auto" w:line="240" w:before="0" w:after="0"/>
               <w:jc w:val="start"/>
               <w:rPr>
@@ -2503,6 +2578,7 @@
             <w:pPr>
               <w:pStyle w:val="Normal"/>
               <w:widowControl/>
+              <w:suppressAutoHyphens w:val="true"/>
               <w:spacing w:lineRule="auto" w:line="240" w:before="0" w:after="0"/>
               <w:jc w:val="start"/>
               <w:rPr>
@@ -2536,6 +2612,7 @@
             <w:pPr>
               <w:pStyle w:val="Normal"/>
               <w:widowControl/>
+              <w:suppressAutoHyphens w:val="true"/>
               <w:spacing w:lineRule="auto" w:line="240" w:before="0" w:after="0"/>
               <w:jc w:val="start"/>
               <w:rPr>
@@ -2567,6 +2644,7 @@
             <w:pPr>
               <w:pStyle w:val="Normal"/>
               <w:widowControl/>
+              <w:suppressAutoHyphens w:val="true"/>
               <w:spacing w:lineRule="auto" w:line="240" w:before="0" w:after="0"/>
               <w:jc w:val="start"/>
               <w:rPr>
@@ -2598,6 +2676,7 @@
             <w:pPr>
               <w:pStyle w:val="Normal"/>
               <w:widowControl/>
+              <w:suppressAutoHyphens w:val="true"/>
               <w:spacing w:lineRule="auto" w:line="240" w:before="0" w:after="0"/>
               <w:jc w:val="start"/>
               <w:rPr>
@@ -2628,6 +2707,7 @@
             <w:pPr>
               <w:pStyle w:val="Normal"/>
               <w:widowControl/>
+              <w:suppressAutoHyphens w:val="true"/>
               <w:spacing w:lineRule="auto" w:line="240" w:before="0" w:after="0"/>
               <w:jc w:val="start"/>
               <w:rPr>
@@ -2661,6 +2741,7 @@
             <w:pPr>
               <w:pStyle w:val="Normal"/>
               <w:widowControl/>
+              <w:suppressAutoHyphens w:val="true"/>
               <w:spacing w:lineRule="auto" w:line="240" w:before="0" w:after="0"/>
               <w:jc w:val="start"/>
               <w:rPr>
@@ -2691,6 +2772,7 @@
             <w:pPr>
               <w:pStyle w:val="Normal"/>
               <w:widowControl/>
+              <w:suppressAutoHyphens w:val="true"/>
               <w:spacing w:lineRule="auto" w:line="240" w:before="0" w:after="0"/>
               <w:jc w:val="start"/>
               <w:rPr>
@@ -2721,22 +2803,18 @@
             <w:pPr>
               <w:pStyle w:val="Normal"/>
               <w:widowControl/>
-              <w:spacing w:lineRule="auto" w:line="240" w:before="0" w:after="0"/>
-              <w:jc w:val="start"/>
-              <w:rPr>
-                <w:b/>
-                <w:bCs/>
-              </w:rPr>
-            </w:pPr>
-            <w:r>
-              <w:rPr>
-                <w:rFonts w:eastAsia="Aptos" w:cs=""/>
-                <w:b/>
-                <w:bCs/>
-                <w:kern w:val="2"/>
-                <w:sz w:val="24"/>
-                <w:szCs w:val="22"/>
-                <w:lang w:val="es-AR" w:eastAsia="en-US" w:bidi="ar-SA"/>
+              <w:suppressAutoHyphens w:val="true"/>
+              <w:spacing w:lineRule="auto" w:line="240" w:before="0" w:after="0"/>
+              <w:jc w:val="start"/>
+              <w:rPr>
+                <w:b/>
+                <w:bCs/>
+              </w:rPr>
+            </w:pPr>
+            <w:r>
+              <w:rPr>
+                <w:b/>
+                <w:bCs/>
               </w:rPr>
             </w:r>
           </w:p>
@@ -2750,22 +2828,18 @@
             <w:pPr>
               <w:pStyle w:val="Normal"/>
               <w:widowControl/>
-              <w:spacing w:lineRule="auto" w:line="240" w:before="0" w:after="0"/>
-              <w:jc w:val="start"/>
-              <w:rPr>
-                <w:b/>
-                <w:bCs/>
-              </w:rPr>
-            </w:pPr>
-            <w:r>
-              <w:rPr>
-                <w:rFonts w:eastAsia="Aptos" w:cs=""/>
-                <w:b/>
-                <w:bCs/>
-                <w:kern w:val="2"/>
-                <w:sz w:val="24"/>
-                <w:szCs w:val="22"/>
-                <w:lang w:val="es-AR" w:eastAsia="en-US" w:bidi="ar-SA"/>
+              <w:suppressAutoHyphens w:val="true"/>
+              <w:spacing w:lineRule="auto" w:line="240" w:before="0" w:after="0"/>
+              <w:jc w:val="start"/>
+              <w:rPr>
+                <w:b/>
+                <w:bCs/>
+              </w:rPr>
+            </w:pPr>
+            <w:r>
+              <w:rPr>
+                <w:b/>
+                <w:bCs/>
               </w:rPr>
             </w:r>
           </w:p>
@@ -3618,6 +3692,7 @@
     <w:rsid w:val="0035338b"/>
     <w:pPr>
       <w:widowControl/>
+      <w:suppressAutoHyphens w:val="true"/>
       <w:bidi w:val="0"/>
       <w:spacing w:lineRule="auto" w:line="360" w:before="0" w:after="120"/>
       <w:jc w:val="start"/>
@@ -4096,6 +4171,32 @@
       <w:rFonts w:cs="Roboto"/>
     </w:rPr>
   </w:style>
+  <w:style w:type="paragraph" w:styleId="Ttulouser">
+    <w:name w:val="Título (user)"/>
+    <w:basedOn w:val="Normal"/>
+    <w:next w:val="BodyText"/>
+    <w:qFormat/>
+    <w:pPr>
+      <w:keepNext w:val="true"/>
+      <w:spacing w:before="240" w:after="120"/>
+    </w:pPr>
+    <w:rPr>
+      <w:rFonts w:ascii="Liberation Sans" w:hAnsi="Liberation Sans" w:eastAsia="Noto Sans" w:cs="Roboto"/>
+      <w:sz w:val="28"/>
+      <w:szCs w:val="28"/>
+    </w:rPr>
+  </w:style>
+  <w:style w:type="paragraph" w:styleId="ndiceuser">
+    <w:name w:val="Índice (user)"/>
+    <w:basedOn w:val="Normal"/>
+    <w:qFormat/>
+    <w:pPr>
+      <w:suppressLineNumbers/>
+    </w:pPr>
+    <w:rPr>
+      <w:rFonts w:cs="Roboto"/>
+    </w:rPr>
+  </w:style>
   <w:style w:type="paragraph" w:styleId="Title">
     <w:name w:val="Title"/>
     <w:basedOn w:val="Normal"/>
@@ -4203,8 +4304,8 @@
       <w:szCs w:val="24"/>
     </w:rPr>
   </w:style>
-  <w:style w:type="numbering" w:styleId="Ningunalista" w:default="1">
-    <w:name w:val="Ninguna lista"/>
+  <w:style w:type="numbering" w:styleId="Ningunalistauser" w:default="1">
+    <w:name w:val="Ninguna lista (user)"/>
     <w:uiPriority w:val="99"/>
     <w:semiHidden/>
     <w:unhideWhenUsed/>

</xml_diff>